<commit_message>
Update submission package with full RadioML results
</commit_message>
<xml_diff>
--- a/submission_files/results_in_engineering_upload_package/02_Highlights.docx
+++ b/submission_files/results_in_engineering_upload_package/02_Highlights.docx
@@ -30,7 +30,16 @@
         <w:ind w:left="360" w:hanging="216"/>
       </w:pPr>
       <w:r>
-        <w:t>Classical ML, CNN, and quantum-inspired kernels are compared.</w:t>
+        <w:t>Full RadioML2016.10A GPU validation covers 220,000 examples.</w:t>
+      </w:r>
+    </w:p>
+    <w:p>
+      <w:pPr>
+        <w:pStyle w:val="ListBullet"/>
+        <w:ind w:left="360" w:hanging="216"/>
+      </w:pPr>
+      <w:r>
+        <w:t>Classical ML, raw-IQ CNN, and quantum-inspired kernels are compared.</w:t>
       </w:r>
     </w:p>
     <w:p>
@@ -40,15 +49,6 @@
       </w:pPr>
       <w:r>
         <w:t>Robustness-drop metrics reveal stress-specific model failure modes.</w:t>
-      </w:r>
-    </w:p>
-    <w:p>
-      <w:pPr>
-        <w:pStyle w:val="ListBullet"/>
-        <w:ind w:left="360" w:hanging="216"/>
-      </w:pPr>
-      <w:r>
-        <w:t>RadioML2016.10A smoke tests validate the public-benchmark workflow.</w:t>
       </w:r>
     </w:p>
     <w:p>

</xml_diff>

<commit_message>
Strengthen manuscript novelty and literature review
</commit_message>
<xml_diff>
--- a/submission_files/results_in_engineering_upload_package/02_Highlights.docx
+++ b/submission_files/results_in_engineering_upload_package/02_Highlights.docx
@@ -21,7 +21,7 @@
         <w:ind w:left="360" w:hanging="216"/>
       </w:pPr>
       <w:r>
-        <w:t>Robust RF classifiers are evaluated under jamming and low-SNR stress.</w:t>
+        <w:t>Reproducible robustness benchmark evaluates RF classifiers under stress.</w:t>
       </w:r>
     </w:p>
     <w:p>
@@ -39,7 +39,7 @@
         <w:ind w:left="360" w:hanging="216"/>
       </w:pPr>
       <w:r>
-        <w:t>Classical ML, raw-IQ CNN, and quantum-inspired kernels are compared.</w:t>
+        <w:t>Classical ML, raw-IQ CNN, quantum kernel, and PCA-RBF ablation are compared.</w:t>
       </w:r>
     </w:p>
     <w:p>
@@ -57,7 +57,7 @@
         <w:ind w:left="360" w:hanging="216"/>
       </w:pPr>
       <w:r>
-        <w:t>No quantum-advantage claim is made; results support cautious benchmarking.</w:t>
+        <w:t>Quantum-inspired kernel shows no advantage over same-feature PCA-RBF SVM.</w:t>
       </w:r>
     </w:p>
     <w:sectPr>

</xml_diff>